<commit_message>
add bibbase a publicaciones
</commit_message>
<xml_diff>
--- a/_site/blog/posts/2017-04-23-sitios-web-asombrosos/index.docx
+++ b/_site/blog/posts/2017-04-23-sitios-web-asombrosos/index.docx
@@ -160,7 +160,7 @@
         <w:t xml:space="preserve">: </w:t>
       </w:r>
       <w:r>
-        <w:t xml:space="preserve">conceptualización y redacción</w:t>
+        <w:t xml:space="preserve">conceptualización, metodología, análisis formal, investigación, recursos, curación de datos, redacción, visualización, supervisión, y administración del proyecto</w:t>
       </w:r>
     </w:p>
     <w:p>
@@ -168,7 +168,7 @@
         <w:pStyle w:val="BodyText"/>
       </w:pPr>
       <w:r>
-        <w:t xml:space="preserve">La correspondencia relativa a este artículo debe dirigirse a Edison Achalma, Escuela Profesional de Economía, Universidad Nacional de San Cristóbal de Huamanga, Ayacucho, AYA, Perú, Email:</w:t>
+        <w:t xml:space="preserve">La correspondencia relativa a este artículo debe dirigirse a Edison Achalma, Escuela Profesional de Economía, Universidad Nacional de San Cristóbal de Huamanga, Portal Independencia N° 57, Ayacucho, AYA 5001, Perú, Email:</w:t>
       </w:r>
       <w:r>
         <w:t xml:space="preserve"> </w:t>

</xml_diff>